<commit_message>
ask Claude to test the deliverables against the primer and made fixes to the deliverables as a result, updated claude.md, workflow diagram and did one build loop
</commit_message>
<xml_diff>
--- a/Scenario_2_Vendor_Contract_2/Input Contracts/sample_negotiable.docx
+++ b/Scenario_2_Vendor_Contract_2/Input Contracts/sample_negotiable.docx
@@ -77,7 +77,7 @@
     </w:p>
     <w:p>
       <w:r>
-        <w:t>Vendor commits to 99.5% uptime for the platform, measured monthly. Scheduled maintenance windows are excluded from uptime calculations.</w:t>
+        <w:t>Vendor shall use commercially reasonable efforts to maintain platform availability and shall provide monthly availability reports to Company.</w:t>
       </w:r>
     </w:p>
     <w:p>
@@ -103,7 +103,7 @@
     </w:p>
     <w:p>
       <w:r>
-        <w:t>Vendor shall indemnify Company against third-party intellectual property infringement claims only, limited to gross negligence or wilful misconduct of Vendor.</w:t>
+        <w:t>Each party shall indemnify the other for mutual indemnification arising from gross negligence or wilful misconduct of the indemnifying party's personnel.</w:t>
       </w:r>
     </w:p>
     <w:sectPr>

</xml_diff>